<commit_message>
error reporting button works
</commit_message>
<xml_diff>
--- a/Manual.docx
+++ b/Manual.docx
@@ -1,22 +1,31 @@
 
 <file path=word/document.xml><?xml version="1.0" encoding="utf-8"?>
-<w:document xmlns:wpc="http://schemas.microsoft.com/office/word/2010/wordprocessingCanvas" xmlns:cx="http://schemas.microsoft.com/office/drawing/2014/chartex" xmlns:cx1="http://schemas.microsoft.com/office/drawing/2015/9/8/chartex" xmlns:cx2="http://schemas.microsoft.com/office/drawing/2015/10/21/chartex" xmlns:cx3="http://schemas.microsoft.com/office/drawing/2016/5/9/chartex" xmlns:cx4="http://schemas.microsoft.com/office/drawing/2016/5/10/chartex" xmlns:cx5="http://schemas.microsoft.com/office/drawing/2016/5/11/chartex" xmlns:cx6="http://schemas.microsoft.com/office/drawing/2016/5/12/chartex" xmlns:cx7="http://schemas.microsoft.com/office/drawing/2016/5/13/chartex" xmlns:cx8="http://schemas.microsoft.com/office/drawing/2016/5/14/chartex" xmlns:mc="http://schemas.openxmlformats.org/markup-compatibility/2006" xmlns:aink="http://schemas.microsoft.com/office/drawing/2016/ink" xmlns:am3d="http://schemas.microsoft.com/office/drawing/2017/model3d" xmlns:o="urn:schemas-microsoft-com:office:office" xmlns:oel="http://schemas.microsoft.com/office/2019/extlst" xmlns:r="http://schemas.openxmlformats.org/officeDocument/2006/relationships" xmlns:m="http://schemas.openxmlformats.org/officeDocument/2006/math" xmlns:v="urn:schemas-microsoft-com:vml" xmlns:wp14="http://schemas.microsoft.com/office/word/2010/wordprocessingDrawing" xmlns:wp="http://schemas.openxmlformats.org/drawingml/2006/wordprocessingDrawing" xmlns:w10="urn:schemas-microsoft-com:office:word" xmlns:w="http://schemas.openxmlformats.org/wordprocessingml/2006/main" xmlns:w14="http://schemas.microsoft.com/office/word/2010/wordml" xmlns:w15="http://schemas.microsoft.com/office/word/2012/wordml" xmlns:w16cex="http://schemas.microsoft.com/office/word/2018/wordml/cex" xmlns:w16cid="http://schemas.microsoft.com/office/word/2016/wordml/cid" xmlns:w16="http://schemas.microsoft.com/office/word/2018/wordml" xmlns:w16sdtdh="http://schemas.microsoft.com/office/word/2020/wordml/sdtdatahash" xmlns:w16se="http://schemas.microsoft.com/office/word/2015/wordml/symex" xmlns:wpg="http://schemas.microsoft.com/office/word/2010/wordprocessingGroup" xmlns:wpi="http://schemas.microsoft.com/office/word/2010/wordprocessingInk" xmlns:wne="http://schemas.microsoft.com/office/word/2006/wordml" xmlns:wps="http://schemas.microsoft.com/office/word/2010/wordprocessingShape" mc:Ignorable="w14 w15 w16se w16cid w16 w16cex w16sdtdh wp14">
+<w:document xmlns:wpc="http://schemas.microsoft.com/office/word/2010/wordprocessingCanvas" xmlns:cx="http://schemas.microsoft.com/office/drawing/2014/chartex" xmlns:cx1="http://schemas.microsoft.com/office/drawing/2015/9/8/chartex" xmlns:cx2="http://schemas.microsoft.com/office/drawing/2015/10/21/chartex" xmlns:cx3="http://schemas.microsoft.com/office/drawing/2016/5/9/chartex" xmlns:cx4="http://schemas.microsoft.com/office/drawing/2016/5/10/chartex" xmlns:cx5="http://schemas.microsoft.com/office/drawing/2016/5/11/chartex" xmlns:cx6="http://schemas.microsoft.com/office/drawing/2016/5/12/chartex" xmlns:cx7="http://schemas.microsoft.com/office/drawing/2016/5/13/chartex" xmlns:cx8="http://schemas.microsoft.com/office/drawing/2016/5/14/chartex" xmlns:mc="http://schemas.openxmlformats.org/markup-compatibility/2006" xmlns:aink="http://schemas.microsoft.com/office/drawing/2016/ink" xmlns:am3d="http://schemas.microsoft.com/office/drawing/2017/model3d" xmlns:o="urn:schemas-microsoft-com:office:office" xmlns:oel="http://schemas.microsoft.com/office/2019/extlst" xmlns:r="http://schemas.openxmlformats.org/officeDocument/2006/relationships" xmlns:m="http://schemas.openxmlformats.org/officeDocument/2006/math" xmlns:v="urn:schemas-microsoft-com:vml" xmlns:wp14="http://schemas.microsoft.com/office/word/2010/wordprocessingDrawing" xmlns:wp="http://schemas.openxmlformats.org/drawingml/2006/wordprocessingDrawing" xmlns:w10="urn:schemas-microsoft-com:office:word" xmlns:w="http://schemas.openxmlformats.org/wordprocessingml/2006/main" xmlns:w14="http://schemas.microsoft.com/office/word/2010/wordml" xmlns:w15="http://schemas.microsoft.com/office/word/2012/wordml" xmlns:w16cex="http://schemas.microsoft.com/office/word/2018/wordml/cex" xmlns:w16cid="http://schemas.microsoft.com/office/word/2016/wordml/cid" xmlns:w16="http://schemas.microsoft.com/office/word/2018/wordml" xmlns:w16du="http://schemas.microsoft.com/office/word/2023/wordml/word16du" xmlns:w16sdtdh="http://schemas.microsoft.com/office/word/2020/wordml/sdtdatahash" xmlns:w16se="http://schemas.microsoft.com/office/word/2015/wordml/symex" xmlns:wpg="http://schemas.microsoft.com/office/word/2010/wordprocessingGroup" xmlns:wpi="http://schemas.microsoft.com/office/word/2010/wordprocessingInk" xmlns:wne="http://schemas.microsoft.com/office/word/2006/wordml" xmlns:wps="http://schemas.microsoft.com/office/word/2010/wordprocessingShape" mc:Ignorable="w14 w15 w16se w16cid w16 w16cex w16sdtdh w16du wp14">
   <w:body>
     <w:p>
       <w:pPr>
-        <w:pStyle w:val="Title"/>
-        <w:rPr>
-          <w:rFonts w:ascii="Times" w:hAnsi="Times" w:cs="Times"/>
-          <w:lang w:val="en-US"/>
-        </w:rPr>
-      </w:pPr>
-      <w:r>
-        <w:rPr>
-          <w:rFonts w:ascii="Times" w:hAnsi="Times" w:cs="Times"/>
-          <w:lang w:val="en-US"/>
-        </w:rPr>
-        <w:t>Manual for uploading excel sheets to the centralized CGG meta data database</w:t>
-      </w:r>
+        <w:pStyle w:val="Titel"/>
+        <w:rPr>
+          <w:rFonts w:ascii="Times" w:hAnsi="Times" w:cs="Times"/>
+          <w:lang w:val="en-US"/>
+        </w:rPr>
+      </w:pPr>
+      <w:r>
+        <w:rPr>
+          <w:rFonts w:ascii="Times" w:hAnsi="Times" w:cs="Times"/>
+          <w:lang w:val="en-US"/>
+        </w:rPr>
+        <w:t xml:space="preserve">Manual for uploading excel sheets to the centralized CGG meta data </w:t>
+      </w:r>
+      <w:proofErr w:type="gramStart"/>
+      <w:r>
+        <w:rPr>
+          <w:rFonts w:ascii="Times" w:hAnsi="Times" w:cs="Times"/>
+          <w:lang w:val="en-US"/>
+        </w:rPr>
+        <w:t>database</w:t>
+      </w:r>
+      <w:proofErr w:type="gramEnd"/>
     </w:p>
     <w:p>
       <w:pPr>
@@ -40,7 +49,13 @@
         <w:rPr>
           <w:lang w:val="en-US"/>
         </w:rPr>
-        <w:t>, date: 2024-02-11</w:t>
+        <w:t>, date: 2024-02-</w:t>
+      </w:r>
+      <w:r>
+        <w:rPr>
+          <w:lang w:val="en-US"/>
+        </w:rPr>
+        <w:t>27</w:t>
       </w:r>
     </w:p>
     <w:p>
@@ -115,7 +130,7 @@
       <w:sdtContent>
         <w:p>
           <w:pPr>
-            <w:pStyle w:val="TOCHeading"/>
+            <w:pStyle w:val="Overskrift"/>
             <w:rPr>
               <w:rFonts w:ascii="Times" w:hAnsi="Times" w:cs="Times"/>
             </w:rPr>
@@ -129,7 +144,7 @@
         </w:p>
         <w:p>
           <w:pPr>
-            <w:pStyle w:val="TOC1"/>
+            <w:pStyle w:val="Indholdsfortegnelse1"/>
             <w:tabs>
               <w:tab w:val="right" w:leader="dot" w:pos="9016"/>
             </w:tabs>
@@ -210,7 +225,7 @@
         </w:p>
         <w:p>
           <w:pPr>
-            <w:pStyle w:val="TOC1"/>
+            <w:pStyle w:val="Indholdsfortegnelse1"/>
             <w:tabs>
               <w:tab w:val="right" w:leader="dot" w:pos="9016"/>
             </w:tabs>
@@ -282,7 +297,7 @@
         </w:p>
         <w:p>
           <w:pPr>
-            <w:pStyle w:val="TOC2"/>
+            <w:pStyle w:val="Indholdsfortegnelse2"/>
             <w:tabs>
               <w:tab w:val="right" w:leader="dot" w:pos="9016"/>
             </w:tabs>
@@ -354,7 +369,7 @@
         </w:p>
         <w:p>
           <w:pPr>
-            <w:pStyle w:val="TOC2"/>
+            <w:pStyle w:val="Indholdsfortegnelse2"/>
             <w:tabs>
               <w:tab w:val="right" w:leader="dot" w:pos="9016"/>
             </w:tabs>
@@ -426,7 +441,7 @@
         </w:p>
         <w:p>
           <w:pPr>
-            <w:pStyle w:val="TOC2"/>
+            <w:pStyle w:val="Indholdsfortegnelse2"/>
             <w:tabs>
               <w:tab w:val="right" w:leader="dot" w:pos="9016"/>
             </w:tabs>
@@ -498,7 +513,7 @@
         </w:p>
         <w:p>
           <w:pPr>
-            <w:pStyle w:val="TOC2"/>
+            <w:pStyle w:val="Indholdsfortegnelse2"/>
             <w:tabs>
               <w:tab w:val="right" w:leader="dot" w:pos="9016"/>
             </w:tabs>
@@ -570,7 +585,7 @@
         </w:p>
         <w:p>
           <w:pPr>
-            <w:pStyle w:val="TOC2"/>
+            <w:pStyle w:val="Indholdsfortegnelse2"/>
             <w:tabs>
               <w:tab w:val="right" w:leader="dot" w:pos="9016"/>
             </w:tabs>
@@ -642,7 +657,7 @@
         </w:p>
         <w:p>
           <w:pPr>
-            <w:pStyle w:val="TOC2"/>
+            <w:pStyle w:val="Indholdsfortegnelse2"/>
             <w:tabs>
               <w:tab w:val="right" w:leader="dot" w:pos="9016"/>
             </w:tabs>
@@ -714,7 +729,7 @@
         </w:p>
         <w:p>
           <w:pPr>
-            <w:pStyle w:val="TOC1"/>
+            <w:pStyle w:val="Indholdsfortegnelse1"/>
             <w:tabs>
               <w:tab w:val="right" w:leader="dot" w:pos="9016"/>
             </w:tabs>
@@ -786,7 +801,7 @@
         </w:p>
         <w:p>
           <w:pPr>
-            <w:pStyle w:val="TOC1"/>
+            <w:pStyle w:val="Indholdsfortegnelse1"/>
             <w:tabs>
               <w:tab w:val="right" w:leader="dot" w:pos="9016"/>
             </w:tabs>
@@ -974,7 +989,7 @@
     </w:p>
     <w:p>
       <w:pPr>
-        <w:pStyle w:val="Heading1"/>
+        <w:pStyle w:val="Overskrift1"/>
         <w:rPr>
           <w:rFonts w:ascii="Times" w:hAnsi="Times" w:cs="Times"/>
           <w:lang w:val="en-US"/>
@@ -995,14 +1010,23 @@
           <w:rFonts w:ascii="Times" w:hAnsi="Times" w:cs="Times"/>
           <w:lang w:val="en-US"/>
         </w:rPr>
-        <w:t xml:space="preserve"> guide to uploading</w:t>
+        <w:t xml:space="preserve"> guide to </w:t>
+      </w:r>
+      <w:proofErr w:type="gramStart"/>
+      <w:r>
+        <w:rPr>
+          <w:rFonts w:ascii="Times" w:hAnsi="Times" w:cs="Times"/>
+          <w:lang w:val="en-US"/>
+        </w:rPr>
+        <w:t>uploading</w:t>
       </w:r>
       <w:bookmarkEnd w:id="0"/>
       <w:bookmarkEnd w:id="1"/>
-    </w:p>
-    <w:p>
-      <w:pPr>
-        <w:pStyle w:val="ListParagraph"/>
+      <w:proofErr w:type="gramEnd"/>
+    </w:p>
+    <w:p>
+      <w:pPr>
+        <w:pStyle w:val="Listeafsnit"/>
         <w:numPr>
           <w:ilvl w:val="0"/>
           <w:numId w:val="1"/>
@@ -1022,16 +1046,16 @@
     </w:p>
     <w:p>
       <w:pPr>
-        <w:pStyle w:val="ListParagraph"/>
-        <w:rPr>
-          <w:rFonts w:ascii="Times" w:hAnsi="Times" w:cs="Times"/>
-          <w:lang w:val="en-US"/>
-        </w:rPr>
-      </w:pPr>
-    </w:p>
-    <w:p>
-      <w:pPr>
-        <w:pStyle w:val="ListParagraph"/>
+        <w:pStyle w:val="Listeafsnit"/>
+        <w:rPr>
+          <w:rFonts w:ascii="Times" w:hAnsi="Times" w:cs="Times"/>
+          <w:lang w:val="en-US"/>
+        </w:rPr>
+      </w:pPr>
+    </w:p>
+    <w:p>
+      <w:pPr>
+        <w:pStyle w:val="Listeafsnit"/>
         <w:numPr>
           <w:ilvl w:val="0"/>
           <w:numId w:val="1"/>
@@ -1130,16 +1154,16 @@
     </w:p>
     <w:p>
       <w:pPr>
-        <w:pStyle w:val="ListParagraph"/>
-        <w:rPr>
-          <w:rFonts w:ascii="Times" w:hAnsi="Times" w:cs="Times"/>
-          <w:lang w:val="en-US"/>
-        </w:rPr>
-      </w:pPr>
-    </w:p>
-    <w:p>
-      <w:pPr>
-        <w:pStyle w:val="ListParagraph"/>
+        <w:pStyle w:val="Listeafsnit"/>
+        <w:rPr>
+          <w:rFonts w:ascii="Times" w:hAnsi="Times" w:cs="Times"/>
+          <w:lang w:val="en-US"/>
+        </w:rPr>
+      </w:pPr>
+    </w:p>
+    <w:p>
+      <w:pPr>
+        <w:pStyle w:val="Listeafsnit"/>
         <w:rPr>
           <w:rFonts w:ascii="Times" w:hAnsi="Times" w:cs="Times"/>
           <w:lang w:val="en-US"/>
@@ -1193,39 +1217,7 @@
           <w:color w:val="1F2328"/>
           <w:lang w:val="en-US"/>
         </w:rPr>
-        <w:t xml:space="preserve">To make it easy for you, the </w:t>
-      </w:r>
-      <w:r>
-        <w:rPr>
-          <w:rFonts w:ascii="Times" w:hAnsi="Times" w:cs="Times"/>
-          <w:color w:val="1F2328"/>
-          <w:lang w:val="en-US"/>
-        </w:rPr>
-        <w:t>tables in the</w:t>
-      </w:r>
-      <w:r>
-        <w:rPr>
-          <w:rFonts w:ascii="Times" w:hAnsi="Times" w:cs="Times"/>
-          <w:color w:val="1F2328"/>
-          <w:lang w:val="en-US"/>
-        </w:rPr>
-        <w:t xml:space="preserve"> database are made such that they correspond to </w:t>
-      </w:r>
-      <w:r>
-        <w:rPr>
-          <w:rFonts w:ascii="Times" w:hAnsi="Times" w:cs="Times"/>
-          <w:color w:val="1F2328"/>
-          <w:lang w:val="en-US"/>
-        </w:rPr>
-        <w:t xml:space="preserve">the </w:t>
-      </w:r>
-      <w:r>
-        <w:rPr>
-          <w:rFonts w:ascii="Times" w:hAnsi="Times" w:cs="Times"/>
-          <w:color w:val="1F2328"/>
-          <w:lang w:val="en-US"/>
-        </w:rPr>
-        <w:t xml:space="preserve">sheets you are already using, so there should be no need to change your </w:t>
+        <w:t xml:space="preserve">To make it easy for you, the tables in the database are made such that they correspond to the sheets you are already using, so there should be no need to change your </w:t>
       </w:r>
       <w:r>
         <w:rPr>
@@ -1241,23 +1233,7 @@
           <w:color w:val="1F2328"/>
           <w:lang w:val="en-US"/>
         </w:rPr>
-        <w:t xml:space="preserve"> spreadsheet</w:t>
-      </w:r>
-      <w:r>
-        <w:rPr>
-          <w:rFonts w:ascii="Times" w:hAnsi="Times" w:cs="Times"/>
-          <w:color w:val="1F2328"/>
-          <w:lang w:val="en-US"/>
-        </w:rPr>
-        <w:t xml:space="preserve"> templates</w:t>
-      </w:r>
-      <w:r>
-        <w:rPr>
-          <w:rFonts w:ascii="Times" w:hAnsi="Times" w:cs="Times"/>
-          <w:color w:val="1F2328"/>
-          <w:lang w:val="en-US"/>
-        </w:rPr>
-        <w:t>, and you should be able to upload</w:t>
+        <w:t xml:space="preserve"> spreadsheet templates, and you should be able to upload</w:t>
       </w:r>
       <w:r>
         <w:rPr>
@@ -1413,17 +1389,17 @@
     </w:p>
     <w:p>
       <w:pPr>
-        <w:pStyle w:val="ListParagraph"/>
-        <w:rPr>
-          <w:rFonts w:ascii="Times" w:hAnsi="Times" w:cs="Times"/>
-          <w:color w:val="1F2328"/>
-          <w:lang w:val="en-US"/>
-        </w:rPr>
-      </w:pPr>
-    </w:p>
-    <w:p>
-      <w:pPr>
-        <w:pStyle w:val="ListParagraph"/>
+        <w:pStyle w:val="Listeafsnit"/>
+        <w:rPr>
+          <w:rFonts w:ascii="Times" w:hAnsi="Times" w:cs="Times"/>
+          <w:color w:val="1F2328"/>
+          <w:lang w:val="en-US"/>
+        </w:rPr>
+      </w:pPr>
+    </w:p>
+    <w:p>
+      <w:pPr>
+        <w:pStyle w:val="Listeafsnit"/>
         <w:numPr>
           <w:ilvl w:val="0"/>
           <w:numId w:val="1"/>
@@ -1450,16 +1426,16 @@
     </w:p>
     <w:p>
       <w:pPr>
-        <w:pStyle w:val="ListParagraph"/>
-        <w:rPr>
-          <w:rFonts w:ascii="Times" w:hAnsi="Times" w:cs="Times"/>
-          <w:lang w:val="en-US"/>
-        </w:rPr>
-      </w:pPr>
-    </w:p>
-    <w:p>
-      <w:pPr>
-        <w:pStyle w:val="ListParagraph"/>
+        <w:pStyle w:val="Listeafsnit"/>
+        <w:rPr>
+          <w:rFonts w:ascii="Times" w:hAnsi="Times" w:cs="Times"/>
+          <w:lang w:val="en-US"/>
+        </w:rPr>
+      </w:pPr>
+    </w:p>
+    <w:p>
+      <w:pPr>
+        <w:pStyle w:val="Listeafsnit"/>
         <w:numPr>
           <w:ilvl w:val="0"/>
           <w:numId w:val="1"/>
@@ -1546,16 +1522,16 @@
     </w:p>
     <w:p>
       <w:pPr>
-        <w:pStyle w:val="ListParagraph"/>
-        <w:rPr>
-          <w:rFonts w:ascii="Times" w:hAnsi="Times" w:cs="Times"/>
-          <w:lang w:val="en-US"/>
-        </w:rPr>
-      </w:pPr>
-    </w:p>
-    <w:p>
-      <w:pPr>
-        <w:pStyle w:val="ListParagraph"/>
+        <w:pStyle w:val="Listeafsnit"/>
+        <w:rPr>
+          <w:rFonts w:ascii="Times" w:hAnsi="Times" w:cs="Times"/>
+          <w:lang w:val="en-US"/>
+        </w:rPr>
+      </w:pPr>
+    </w:p>
+    <w:p>
+      <w:pPr>
+        <w:pStyle w:val="Listeafsnit"/>
         <w:numPr>
           <w:ilvl w:val="0"/>
           <w:numId w:val="1"/>
@@ -1625,16 +1601,16 @@
     </w:p>
     <w:p>
       <w:pPr>
-        <w:pStyle w:val="ListParagraph"/>
-        <w:rPr>
-          <w:rFonts w:ascii="Times" w:hAnsi="Times" w:cs="Times"/>
-          <w:lang w:val="en-US"/>
-        </w:rPr>
-      </w:pPr>
-    </w:p>
-    <w:p>
-      <w:pPr>
-        <w:pStyle w:val="ListParagraph"/>
+        <w:pStyle w:val="Listeafsnit"/>
+        <w:rPr>
+          <w:rFonts w:ascii="Times" w:hAnsi="Times" w:cs="Times"/>
+          <w:lang w:val="en-US"/>
+        </w:rPr>
+      </w:pPr>
+    </w:p>
+    <w:p>
+      <w:pPr>
+        <w:pStyle w:val="Listeafsnit"/>
         <w:numPr>
           <w:ilvl w:val="0"/>
           <w:numId w:val="1"/>
@@ -1663,7 +1639,23 @@
           <w:rFonts w:ascii="Times" w:hAnsi="Times" w:cs="Times"/>
           <w:lang w:val="en-US"/>
         </w:rPr>
-        <w:t xml:space="preserve"> This will ensure that your data is uploaded to the correct table, and that the database knows which sheet to expect (as described earlier, it is programmed to accept a fixed amount of standard sheets). </w:t>
+        <w:t xml:space="preserve"> This will ensure that your data is uploaded to the correct table, and that the database knows which sheet to expect (as described earlier, it is programmed to accept a fixed </w:t>
+      </w:r>
+      <w:proofErr w:type="gramStart"/>
+      <w:r>
+        <w:rPr>
+          <w:rFonts w:ascii="Times" w:hAnsi="Times" w:cs="Times"/>
+          <w:lang w:val="en-US"/>
+        </w:rPr>
+        <w:t>amount</w:t>
+      </w:r>
+      <w:proofErr w:type="gramEnd"/>
+      <w:r>
+        <w:rPr>
+          <w:rFonts w:ascii="Times" w:hAnsi="Times" w:cs="Times"/>
+          <w:lang w:val="en-US"/>
+        </w:rPr>
+        <w:t xml:space="preserve"> of standard sheets). </w:t>
       </w:r>
       <w:r>
         <w:rPr>
@@ -1675,16 +1667,16 @@
     </w:p>
     <w:p>
       <w:pPr>
-        <w:pStyle w:val="ListParagraph"/>
-        <w:rPr>
-          <w:rFonts w:ascii="Times" w:hAnsi="Times" w:cs="Times"/>
-          <w:lang w:val="en-US"/>
-        </w:rPr>
-      </w:pPr>
-    </w:p>
-    <w:p>
-      <w:pPr>
-        <w:pStyle w:val="ListParagraph"/>
+        <w:pStyle w:val="Listeafsnit"/>
+        <w:rPr>
+          <w:rFonts w:ascii="Times" w:hAnsi="Times" w:cs="Times"/>
+          <w:lang w:val="en-US"/>
+        </w:rPr>
+      </w:pPr>
+    </w:p>
+    <w:p>
+      <w:pPr>
+        <w:pStyle w:val="Listeafsnit"/>
         <w:numPr>
           <w:ilvl w:val="0"/>
           <w:numId w:val="1"/>
@@ -1718,16 +1710,16 @@
     </w:p>
     <w:p>
       <w:pPr>
-        <w:pStyle w:val="ListParagraph"/>
-        <w:rPr>
-          <w:rFonts w:ascii="Times" w:hAnsi="Times" w:cs="Times"/>
-          <w:lang w:val="en-US"/>
-        </w:rPr>
-      </w:pPr>
-    </w:p>
-    <w:p>
-      <w:pPr>
-        <w:pStyle w:val="ListParagraph"/>
+        <w:pStyle w:val="Listeafsnit"/>
+        <w:rPr>
+          <w:rFonts w:ascii="Times" w:hAnsi="Times" w:cs="Times"/>
+          <w:lang w:val="en-US"/>
+        </w:rPr>
+      </w:pPr>
+    </w:p>
+    <w:p>
+      <w:pPr>
+        <w:pStyle w:val="Listeafsnit"/>
         <w:numPr>
           <w:ilvl w:val="0"/>
           <w:numId w:val="1"/>
@@ -1754,16 +1746,16 @@
     </w:p>
     <w:p>
       <w:pPr>
-        <w:pStyle w:val="ListParagraph"/>
-        <w:rPr>
-          <w:rFonts w:ascii="Times" w:hAnsi="Times" w:cs="Times"/>
-          <w:lang w:val="en-US"/>
-        </w:rPr>
-      </w:pPr>
-    </w:p>
-    <w:p>
-      <w:pPr>
-        <w:pStyle w:val="ListParagraph"/>
+        <w:pStyle w:val="Listeafsnit"/>
+        <w:rPr>
+          <w:rFonts w:ascii="Times" w:hAnsi="Times" w:cs="Times"/>
+          <w:lang w:val="en-US"/>
+        </w:rPr>
+      </w:pPr>
+    </w:p>
+    <w:p>
+      <w:pPr>
+        <w:pStyle w:val="Listeafsnit"/>
         <w:numPr>
           <w:ilvl w:val="0"/>
           <w:numId w:val="1"/>
@@ -1832,16 +1824,16 @@
     </w:p>
     <w:p>
       <w:pPr>
-        <w:pStyle w:val="ListParagraph"/>
-        <w:rPr>
-          <w:rFonts w:ascii="Times" w:hAnsi="Times" w:cs="Times"/>
-          <w:lang w:val="en-US"/>
-        </w:rPr>
-      </w:pPr>
-    </w:p>
-    <w:p>
-      <w:pPr>
-        <w:pStyle w:val="ListParagraph"/>
+        <w:pStyle w:val="Listeafsnit"/>
+        <w:rPr>
+          <w:rFonts w:ascii="Times" w:hAnsi="Times" w:cs="Times"/>
+          <w:lang w:val="en-US"/>
+        </w:rPr>
+      </w:pPr>
+    </w:p>
+    <w:p>
+      <w:pPr>
+        <w:pStyle w:val="Listeafsnit"/>
         <w:numPr>
           <w:ilvl w:val="0"/>
           <w:numId w:val="1"/>
@@ -1872,7 +1864,7 @@
     </w:p>
     <w:p>
       <w:pPr>
-        <w:pStyle w:val="Heading1"/>
+        <w:pStyle w:val="Overskrift1"/>
         <w:rPr>
           <w:rFonts w:ascii="Times" w:hAnsi="Times" w:cs="Times"/>
           <w:lang w:val="en-US"/>
@@ -2026,7 +2018,7 @@
     </w:p>
     <w:p>
       <w:pPr>
-        <w:pStyle w:val="Heading2"/>
+        <w:pStyle w:val="Overskrift2"/>
         <w:rPr>
           <w:rFonts w:ascii="Times" w:hAnsi="Times" w:cs="Times"/>
           <w:lang w:val="en-US"/>
@@ -2051,7 +2043,7 @@
       </w:r>
       <w:r>
         <w:rPr>
-          <w:rStyle w:val="Heading2Char"/>
+          <w:rStyle w:val="Overskrift2Tegn"/>
           <w:rFonts w:ascii="Times" w:hAnsi="Times" w:cs="Times"/>
           <w:lang w:val="en-US"/>
         </w:rPr>
@@ -2086,7 +2078,7 @@
     </w:p>
     <w:p>
       <w:pPr>
-        <w:pStyle w:val="Heading2"/>
+        <w:pStyle w:val="Overskrift2"/>
         <w:rPr>
           <w:rFonts w:ascii="Times" w:hAnsi="Times" w:cs="Times"/>
           <w:lang w:val="en-US"/>
@@ -2128,7 +2120,7 @@
     <w:p>
       <w:pPr>
         <w:rPr>
-          <w:rStyle w:val="Heading2Char"/>
+          <w:rStyle w:val="Overskrift2Tegn"/>
           <w:rFonts w:ascii="Times" w:eastAsiaTheme="minorHAnsi" w:hAnsi="Times" w:cs="Times"/>
           <w:color w:val="1F2328"/>
           <w:sz w:val="22"/>
@@ -2142,7 +2134,25 @@
           <w:color w:val="1F2328"/>
           <w:lang w:val="en-US"/>
         </w:rPr>
-        <w:t xml:space="preserve">Intervals should be in a restricted mathematical notation and only the following characters are allowed: “[“ “)” “,” and numbers (no decimal allowed, unless you use “.” as decimal point). This means that </w:t>
+        <w:t>Intervals should be in a restricted mathematical notation and only the following characters are allowed: “</w:t>
+      </w:r>
+      <w:proofErr w:type="gramStart"/>
+      <w:r>
+        <w:rPr>
+          <w:rFonts w:ascii="Times" w:hAnsi="Times" w:cs="Times"/>
+          <w:color w:val="1F2328"/>
+          <w:lang w:val="en-US"/>
+        </w:rPr>
+        <w:t>[“ “</w:t>
+      </w:r>
+      <w:proofErr w:type="gramEnd"/>
+      <w:r>
+        <w:rPr>
+          <w:rFonts w:ascii="Times" w:hAnsi="Times" w:cs="Times"/>
+          <w:color w:val="1F2328"/>
+          <w:lang w:val="en-US"/>
+        </w:rPr>
+        <w:t xml:space="preserve">)” “,” and numbers (no decimal allowed, unless you use “.” as decimal point). This means that </w:t>
       </w:r>
       <w:r>
         <w:rPr>
@@ -2198,7 +2208,7 @@
     <w:p>
       <w:pPr>
         <w:rPr>
-          <w:rStyle w:val="Heading2Char"/>
+          <w:rStyle w:val="Overskrift2Tegn"/>
           <w:rFonts w:ascii="Times" w:hAnsi="Times" w:cs="Times"/>
           <w:lang w:val="en-US"/>
         </w:rPr>
@@ -2207,7 +2217,7 @@
       <w:bookmarkStart w:id="9" w:name="_Toc159397494"/>
       <w:r>
         <w:rPr>
-          <w:rStyle w:val="Heading2Char"/>
+          <w:rStyle w:val="Overskrift2Tegn"/>
           <w:rFonts w:ascii="Times" w:hAnsi="Times" w:cs="Times"/>
           <w:lang w:val="en-US"/>
         </w:rPr>
@@ -2215,7 +2225,7 @@
       </w:r>
       <w:r>
         <w:rPr>
-          <w:rStyle w:val="Heading2Char"/>
+          <w:rStyle w:val="Overskrift2Tegn"/>
           <w:rFonts w:ascii="Times" w:hAnsi="Times" w:cs="Times"/>
           <w:lang w:val="en-US"/>
         </w:rPr>
@@ -2223,7 +2233,7 @@
       </w:r>
       <w:r>
         <w:rPr>
-          <w:rStyle w:val="Heading2Char"/>
+          <w:rStyle w:val="Overskrift2Tegn"/>
           <w:rFonts w:ascii="Times" w:hAnsi="Times" w:cs="Times"/>
           <w:lang w:val="en-US"/>
         </w:rPr>
@@ -2231,7 +2241,7 @@
       </w:r>
       <w:r>
         <w:rPr>
-          <w:rStyle w:val="Heading2Char"/>
+          <w:rStyle w:val="Overskrift2Tegn"/>
           <w:rFonts w:ascii="Times" w:hAnsi="Times" w:cs="Times"/>
           <w:lang w:val="en-US"/>
         </w:rPr>
@@ -2360,7 +2370,7 @@
     </w:p>
     <w:p>
       <w:pPr>
-        <w:pStyle w:val="Heading2"/>
+        <w:pStyle w:val="Overskrift2"/>
         <w:rPr>
           <w:rFonts w:ascii="Times" w:hAnsi="Times" w:cs="Times"/>
           <w:lang w:val="en-US"/>
@@ -2550,7 +2560,7 @@
     </w:p>
     <w:p>
       <w:pPr>
-        <w:pStyle w:val="Heading2"/>
+        <w:pStyle w:val="Overskrift2"/>
         <w:rPr>
           <w:rFonts w:ascii="Times" w:hAnsi="Times" w:cs="Times"/>
           <w:lang w:val="en-US"/>
@@ -2574,7 +2584,7 @@
       </w:r>
       <w:r>
         <w:rPr>
-          <w:rStyle w:val="Heading2Char"/>
+          <w:rStyle w:val="Overskrift2Tegn"/>
           <w:rFonts w:ascii="Times" w:hAnsi="Times" w:cs="Times"/>
           <w:lang w:val="en-US"/>
         </w:rPr>
@@ -2607,7 +2617,7 @@
     </w:p>
     <w:p>
       <w:pPr>
-        <w:pStyle w:val="Heading2"/>
+        <w:pStyle w:val="Overskrift2"/>
         <w:rPr>
           <w:rFonts w:ascii="Times" w:hAnsi="Times" w:cs="Times"/>
           <w:lang w:val="en-US"/>
@@ -2631,7 +2641,7 @@
       </w:r>
       <w:r>
         <w:rPr>
-          <w:rStyle w:val="Heading2Char"/>
+          <w:rStyle w:val="Overskrift2Tegn"/>
           <w:rFonts w:ascii="Times" w:hAnsi="Times" w:cs="Times"/>
           <w:lang w:val="en-US"/>
         </w:rPr>
@@ -2693,7 +2703,7 @@
     </w:p>
     <w:p>
       <w:pPr>
-        <w:pStyle w:val="Heading1"/>
+        <w:pStyle w:val="Overskrift1"/>
         <w:rPr>
           <w:rFonts w:ascii="Times" w:hAnsi="Times" w:cs="Times"/>
           <w:lang w:val="en-US"/>
@@ -2833,7 +2843,7 @@
       </w:r>
       <w:r>
         <w:rPr>
-          <w:rStyle w:val="FootnoteReference"/>
+          <w:rStyle w:val="Fodnotehenvisning"/>
           <w:rFonts w:ascii="Times" w:hAnsi="Times" w:cs="Times"/>
           <w:lang w:val="en-US"/>
         </w:rPr>
@@ -2948,26 +2958,94 @@
     </w:p>
     <w:p>
       <w:pPr>
-        <w:pStyle w:val="Heading1"/>
-        <w:rPr>
-          <w:rStyle w:val="Strong"/>
+        <w:pStyle w:val="Overskrift1"/>
+        <w:rPr>
+          <w:rStyle w:val="Strk"/>
           <w:rFonts w:ascii="Times" w:hAnsi="Times" w:cs="Times"/>
           <w:b w:val="0"/>
           <w:bCs w:val="0"/>
-          <w:lang w:val="en-US"/>
         </w:rPr>
       </w:pPr>
       <w:bookmarkStart w:id="18" w:name="_Toc159310738"/>
       <w:bookmarkStart w:id="19" w:name="_Toc159397499"/>
-      <w:r>
-        <w:rPr>
-          <w:rStyle w:val="Strong"/>
+      <w:proofErr w:type="spellStart"/>
+      <w:r>
+        <w:rPr>
+          <w:rStyle w:val="Strk"/>
           <w:rFonts w:ascii="Times" w:hAnsi="Times" w:cs="Times"/>
           <w:b w:val="0"/>
           <w:bCs w:val="0"/>
-          <w:lang w:val="en-US"/>
         </w:rPr>
         <w:lastRenderedPageBreak/>
+        <w:t>Error</w:t>
+      </w:r>
+      <w:r>
+        <w:rPr>
+          <w:rStyle w:val="Strk"/>
+          <w:rFonts w:ascii="Times" w:hAnsi="Times" w:cs="Times"/>
+          <w:b w:val="0"/>
+          <w:bCs w:val="0"/>
+        </w:rPr>
+        <w:t>s</w:t>
+      </w:r>
+      <w:proofErr w:type="spellEnd"/>
+    </w:p>
+    <w:p>
+      <w:pPr>
+        <w:rPr>
+          <w:rFonts w:ascii="Times" w:hAnsi="Times" w:cs="Times"/>
+          <w:lang w:val="en-US"/>
+        </w:rPr>
+      </w:pPr>
+      <w:r>
+        <w:rPr>
+          <w:rFonts w:ascii="Times" w:hAnsi="Times" w:cs="Times"/>
+          <w:lang w:val="en-US"/>
+        </w:rPr>
+        <w:t>During upload, you will most likely encounter errors. Most of the time, these are due to unexpected formatting, and should be easily fixed by yourself. However, if you encounter any errors that you cannot fix yourself, make sure to contact admin with the time and date of when the error happened and the traceback shown on the error page.</w:t>
+      </w:r>
+    </w:p>
+    <w:p>
+      <w:pPr>
+        <w:rPr>
+          <w:rFonts w:ascii="Times" w:hAnsi="Times" w:cs="Times"/>
+          <w:lang w:val="en-US" w:eastAsia="da-DK"/>
+        </w:rPr>
+      </w:pPr>
+      <w:r>
+        <w:rPr>
+          <w:rFonts w:ascii="Times" w:hAnsi="Times" w:cs="Times"/>
+          <w:lang w:val="en-US" w:eastAsia="da-DK"/>
+        </w:rPr>
+        <w:t>If you encounter a “Internal Server Error”, this means you encountered an error I did not anticipate.  Please notify me with the time and date for when it occurred, so I can investigate the error log.</w:t>
+      </w:r>
+    </w:p>
+    <w:p>
+      <w:pPr>
+        <w:rPr>
+          <w:lang w:val="en-US"/>
+        </w:rPr>
+      </w:pPr>
+    </w:p>
+    <w:p>
+      <w:pPr>
+        <w:pStyle w:val="Overskrift1"/>
+        <w:rPr>
+          <w:rStyle w:val="Strk"/>
+          <w:rFonts w:ascii="Times" w:hAnsi="Times" w:cs="Times"/>
+          <w:b w:val="0"/>
+          <w:bCs w:val="0"/>
+          <w:lang w:val="en-US"/>
+        </w:rPr>
+      </w:pPr>
+      <w:r>
+        <w:rPr>
+          <w:rStyle w:val="Strk"/>
+          <w:rFonts w:ascii="Times" w:hAnsi="Times" w:cs="Times"/>
+          <w:b w:val="0"/>
+          <w:bCs w:val="0"/>
+          <w:lang w:val="en-US"/>
+        </w:rPr>
         <w:t>Admin contact info</w:t>
       </w:r>
       <w:bookmarkEnd w:id="18"/>
@@ -3007,7 +3085,7 @@
     </w:p>
     <w:p>
       <w:pPr>
-        <w:pStyle w:val="Heading1"/>
+        <w:pStyle w:val="Overskrift1"/>
         <w:rPr>
           <w:rFonts w:ascii="Times" w:hAnsi="Times" w:cs="Times"/>
           <w:lang w:val="en-US"/>
@@ -3041,7 +3119,7 @@
 </file>
 
 <file path=word/endnotes.xml><?xml version="1.0" encoding="utf-8"?>
-<w:endnotes xmlns:wpc="http://schemas.microsoft.com/office/word/2010/wordprocessingCanvas" xmlns:cx="http://schemas.microsoft.com/office/drawing/2014/chartex" xmlns:cx1="http://schemas.microsoft.com/office/drawing/2015/9/8/chartex" xmlns:cx2="http://schemas.microsoft.com/office/drawing/2015/10/21/chartex" xmlns:cx3="http://schemas.microsoft.com/office/drawing/2016/5/9/chartex" xmlns:cx4="http://schemas.microsoft.com/office/drawing/2016/5/10/chartex" xmlns:cx5="http://schemas.microsoft.com/office/drawing/2016/5/11/chartex" xmlns:cx6="http://schemas.microsoft.com/office/drawing/2016/5/12/chartex" xmlns:cx7="http://schemas.microsoft.com/office/drawing/2016/5/13/chartex" xmlns:cx8="http://schemas.microsoft.com/office/drawing/2016/5/14/chartex" xmlns:mc="http://schemas.openxmlformats.org/markup-compatibility/2006" xmlns:aink="http://schemas.microsoft.com/office/drawing/2016/ink" xmlns:am3d="http://schemas.microsoft.com/office/drawing/2017/model3d" xmlns:o="urn:schemas-microsoft-com:office:office" xmlns:oel="http://schemas.microsoft.com/office/2019/extlst" xmlns:r="http://schemas.openxmlformats.org/officeDocument/2006/relationships" xmlns:m="http://schemas.openxmlformats.org/officeDocument/2006/math" xmlns:v="urn:schemas-microsoft-com:vml" xmlns:wp14="http://schemas.microsoft.com/office/word/2010/wordprocessingDrawing" xmlns:wp="http://schemas.openxmlformats.org/drawingml/2006/wordprocessingDrawing" xmlns:w10="urn:schemas-microsoft-com:office:word" xmlns:w="http://schemas.openxmlformats.org/wordprocessingml/2006/main" xmlns:w14="http://schemas.microsoft.com/office/word/2010/wordml" xmlns:w15="http://schemas.microsoft.com/office/word/2012/wordml" xmlns:w16cex="http://schemas.microsoft.com/office/word/2018/wordml/cex" xmlns:w16cid="http://schemas.microsoft.com/office/word/2016/wordml/cid" xmlns:w16="http://schemas.microsoft.com/office/word/2018/wordml" xmlns:w16sdtdh="http://schemas.microsoft.com/office/word/2020/wordml/sdtdatahash" xmlns:w16se="http://schemas.microsoft.com/office/word/2015/wordml/symex" xmlns:wpg="http://schemas.microsoft.com/office/word/2010/wordprocessingGroup" xmlns:wpi="http://schemas.microsoft.com/office/word/2010/wordprocessingInk" xmlns:wne="http://schemas.microsoft.com/office/word/2006/wordml" xmlns:wps="http://schemas.microsoft.com/office/word/2010/wordprocessingShape" mc:Ignorable="w14 w15 w16se w16cid w16 w16cex w16sdtdh wp14">
+<w:endnotes xmlns:wpc="http://schemas.microsoft.com/office/word/2010/wordprocessingCanvas" xmlns:cx="http://schemas.microsoft.com/office/drawing/2014/chartex" xmlns:cx1="http://schemas.microsoft.com/office/drawing/2015/9/8/chartex" xmlns:cx2="http://schemas.microsoft.com/office/drawing/2015/10/21/chartex" xmlns:cx3="http://schemas.microsoft.com/office/drawing/2016/5/9/chartex" xmlns:cx4="http://schemas.microsoft.com/office/drawing/2016/5/10/chartex" xmlns:cx5="http://schemas.microsoft.com/office/drawing/2016/5/11/chartex" xmlns:cx6="http://schemas.microsoft.com/office/drawing/2016/5/12/chartex" xmlns:cx7="http://schemas.microsoft.com/office/drawing/2016/5/13/chartex" xmlns:cx8="http://schemas.microsoft.com/office/drawing/2016/5/14/chartex" xmlns:mc="http://schemas.openxmlformats.org/markup-compatibility/2006" xmlns:aink="http://schemas.microsoft.com/office/drawing/2016/ink" xmlns:am3d="http://schemas.microsoft.com/office/drawing/2017/model3d" xmlns:o="urn:schemas-microsoft-com:office:office" xmlns:oel="http://schemas.microsoft.com/office/2019/extlst" xmlns:r="http://schemas.openxmlformats.org/officeDocument/2006/relationships" xmlns:m="http://schemas.openxmlformats.org/officeDocument/2006/math" xmlns:v="urn:schemas-microsoft-com:vml" xmlns:wp14="http://schemas.microsoft.com/office/word/2010/wordprocessingDrawing" xmlns:wp="http://schemas.openxmlformats.org/drawingml/2006/wordprocessingDrawing" xmlns:w10="urn:schemas-microsoft-com:office:word" xmlns:w="http://schemas.openxmlformats.org/wordprocessingml/2006/main" xmlns:w14="http://schemas.microsoft.com/office/word/2010/wordml" xmlns:w15="http://schemas.microsoft.com/office/word/2012/wordml" xmlns:w16cex="http://schemas.microsoft.com/office/word/2018/wordml/cex" xmlns:w16cid="http://schemas.microsoft.com/office/word/2016/wordml/cid" xmlns:w16="http://schemas.microsoft.com/office/word/2018/wordml" xmlns:w16du="http://schemas.microsoft.com/office/word/2023/wordml/word16du" xmlns:w16sdtdh="http://schemas.microsoft.com/office/word/2020/wordml/sdtdatahash" xmlns:w16se="http://schemas.microsoft.com/office/word/2015/wordml/symex" xmlns:wpg="http://schemas.microsoft.com/office/word/2010/wordprocessingGroup" xmlns:wpi="http://schemas.microsoft.com/office/word/2010/wordprocessingInk" xmlns:wne="http://schemas.microsoft.com/office/word/2006/wordml" xmlns:wps="http://schemas.microsoft.com/office/word/2010/wordprocessingShape" mc:Ignorable="w14 w15 w16se w16cid w16 w16cex w16sdtdh w16du wp14">
   <w:endnote w:type="separator" w:id="-1">
     <w:p>
       <w:pPr>
@@ -3066,7 +3144,7 @@
 </file>
 
 <file path=word/footnotes.xml><?xml version="1.0" encoding="utf-8"?>
-<w:footnotes xmlns:wpc="http://schemas.microsoft.com/office/word/2010/wordprocessingCanvas" xmlns:cx="http://schemas.microsoft.com/office/drawing/2014/chartex" xmlns:cx1="http://schemas.microsoft.com/office/drawing/2015/9/8/chartex" xmlns:cx2="http://schemas.microsoft.com/office/drawing/2015/10/21/chartex" xmlns:cx3="http://schemas.microsoft.com/office/drawing/2016/5/9/chartex" xmlns:cx4="http://schemas.microsoft.com/office/drawing/2016/5/10/chartex" xmlns:cx5="http://schemas.microsoft.com/office/drawing/2016/5/11/chartex" xmlns:cx6="http://schemas.microsoft.com/office/drawing/2016/5/12/chartex" xmlns:cx7="http://schemas.microsoft.com/office/drawing/2016/5/13/chartex" xmlns:cx8="http://schemas.microsoft.com/office/drawing/2016/5/14/chartex" xmlns:mc="http://schemas.openxmlformats.org/markup-compatibility/2006" xmlns:aink="http://schemas.microsoft.com/office/drawing/2016/ink" xmlns:am3d="http://schemas.microsoft.com/office/drawing/2017/model3d" xmlns:o="urn:schemas-microsoft-com:office:office" xmlns:oel="http://schemas.microsoft.com/office/2019/extlst" xmlns:r="http://schemas.openxmlformats.org/officeDocument/2006/relationships" xmlns:m="http://schemas.openxmlformats.org/officeDocument/2006/math" xmlns:v="urn:schemas-microsoft-com:vml" xmlns:wp14="http://schemas.microsoft.com/office/word/2010/wordprocessingDrawing" xmlns:wp="http://schemas.openxmlformats.org/drawingml/2006/wordprocessingDrawing" xmlns:w10="urn:schemas-microsoft-com:office:word" xmlns:w="http://schemas.openxmlformats.org/wordprocessingml/2006/main" xmlns:w14="http://schemas.microsoft.com/office/word/2010/wordml" xmlns:w15="http://schemas.microsoft.com/office/word/2012/wordml" xmlns:w16cex="http://schemas.microsoft.com/office/word/2018/wordml/cex" xmlns:w16cid="http://schemas.microsoft.com/office/word/2016/wordml/cid" xmlns:w16="http://schemas.microsoft.com/office/word/2018/wordml" xmlns:w16sdtdh="http://schemas.microsoft.com/office/word/2020/wordml/sdtdatahash" xmlns:w16se="http://schemas.microsoft.com/office/word/2015/wordml/symex" xmlns:wpg="http://schemas.microsoft.com/office/word/2010/wordprocessingGroup" xmlns:wpi="http://schemas.microsoft.com/office/word/2010/wordprocessingInk" xmlns:wne="http://schemas.microsoft.com/office/word/2006/wordml" xmlns:wps="http://schemas.microsoft.com/office/word/2010/wordprocessingShape" mc:Ignorable="w14 w15 w16se w16cid w16 w16cex w16sdtdh wp14">
+<w:footnotes xmlns:wpc="http://schemas.microsoft.com/office/word/2010/wordprocessingCanvas" xmlns:cx="http://schemas.microsoft.com/office/drawing/2014/chartex" xmlns:cx1="http://schemas.microsoft.com/office/drawing/2015/9/8/chartex" xmlns:cx2="http://schemas.microsoft.com/office/drawing/2015/10/21/chartex" xmlns:cx3="http://schemas.microsoft.com/office/drawing/2016/5/9/chartex" xmlns:cx4="http://schemas.microsoft.com/office/drawing/2016/5/10/chartex" xmlns:cx5="http://schemas.microsoft.com/office/drawing/2016/5/11/chartex" xmlns:cx6="http://schemas.microsoft.com/office/drawing/2016/5/12/chartex" xmlns:cx7="http://schemas.microsoft.com/office/drawing/2016/5/13/chartex" xmlns:cx8="http://schemas.microsoft.com/office/drawing/2016/5/14/chartex" xmlns:mc="http://schemas.openxmlformats.org/markup-compatibility/2006" xmlns:aink="http://schemas.microsoft.com/office/drawing/2016/ink" xmlns:am3d="http://schemas.microsoft.com/office/drawing/2017/model3d" xmlns:o="urn:schemas-microsoft-com:office:office" xmlns:oel="http://schemas.microsoft.com/office/2019/extlst" xmlns:r="http://schemas.openxmlformats.org/officeDocument/2006/relationships" xmlns:m="http://schemas.openxmlformats.org/officeDocument/2006/math" xmlns:v="urn:schemas-microsoft-com:vml" xmlns:wp14="http://schemas.microsoft.com/office/word/2010/wordprocessingDrawing" xmlns:wp="http://schemas.openxmlformats.org/drawingml/2006/wordprocessingDrawing" xmlns:w10="urn:schemas-microsoft-com:office:word" xmlns:w="http://schemas.openxmlformats.org/wordprocessingml/2006/main" xmlns:w14="http://schemas.microsoft.com/office/word/2010/wordml" xmlns:w15="http://schemas.microsoft.com/office/word/2012/wordml" xmlns:w16cex="http://schemas.microsoft.com/office/word/2018/wordml/cex" xmlns:w16cid="http://schemas.microsoft.com/office/word/2016/wordml/cid" xmlns:w16="http://schemas.microsoft.com/office/word/2018/wordml" xmlns:w16du="http://schemas.microsoft.com/office/word/2023/wordml/word16du" xmlns:w16sdtdh="http://schemas.microsoft.com/office/word/2020/wordml/sdtdatahash" xmlns:w16se="http://schemas.microsoft.com/office/word/2015/wordml/symex" xmlns:wpg="http://schemas.microsoft.com/office/word/2010/wordprocessingGroup" xmlns:wpi="http://schemas.microsoft.com/office/word/2010/wordprocessingInk" xmlns:wne="http://schemas.microsoft.com/office/word/2006/wordml" xmlns:wps="http://schemas.microsoft.com/office/word/2010/wordprocessingShape" mc:Ignorable="w14 w15 w16se w16cid w16 w16cex w16sdtdh w16du wp14">
   <w:footnote w:type="separator" w:id="-1">
     <w:p>
       <w:pPr>
@@ -3090,14 +3168,14 @@
   <w:footnote w:id="1">
     <w:p>
       <w:pPr>
-        <w:pStyle w:val="FootnoteText"/>
-        <w:rPr>
-          <w:lang w:val="en-US"/>
-        </w:rPr>
-      </w:pPr>
-      <w:r>
-        <w:rPr>
-          <w:rStyle w:val="FootnoteReference"/>
+        <w:pStyle w:val="Fodnotetekst"/>
+        <w:rPr>
+          <w:lang w:val="en-US"/>
+        </w:rPr>
+      </w:pPr>
+      <w:r>
+        <w:rPr>
+          <w:rStyle w:val="Fodnotehenvisning"/>
         </w:rPr>
         <w:footnoteRef/>
       </w:r>
@@ -3124,7 +3202,7 @@
 </file>
 
 <file path=word/numbering.xml><?xml version="1.0" encoding="utf-8"?>
-<w:numbering xmlns:wpc="http://schemas.microsoft.com/office/word/2010/wordprocessingCanvas" xmlns:cx="http://schemas.microsoft.com/office/drawing/2014/chartex" xmlns:cx1="http://schemas.microsoft.com/office/drawing/2015/9/8/chartex" xmlns:cx2="http://schemas.microsoft.com/office/drawing/2015/10/21/chartex" xmlns:cx3="http://schemas.microsoft.com/office/drawing/2016/5/9/chartex" xmlns:cx4="http://schemas.microsoft.com/office/drawing/2016/5/10/chartex" xmlns:cx5="http://schemas.microsoft.com/office/drawing/2016/5/11/chartex" xmlns:cx6="http://schemas.microsoft.com/office/drawing/2016/5/12/chartex" xmlns:cx7="http://schemas.microsoft.com/office/drawing/2016/5/13/chartex" xmlns:cx8="http://schemas.microsoft.com/office/drawing/2016/5/14/chartex" xmlns:mc="http://schemas.openxmlformats.org/markup-compatibility/2006" xmlns:aink="http://schemas.microsoft.com/office/drawing/2016/ink" xmlns:am3d="http://schemas.microsoft.com/office/drawing/2017/model3d" xmlns:o="urn:schemas-microsoft-com:office:office" xmlns:oel="http://schemas.microsoft.com/office/2019/extlst" xmlns:r="http://schemas.openxmlformats.org/officeDocument/2006/relationships" xmlns:m="http://schemas.openxmlformats.org/officeDocument/2006/math" xmlns:v="urn:schemas-microsoft-com:vml" xmlns:wp14="http://schemas.microsoft.com/office/word/2010/wordprocessingDrawing" xmlns:wp="http://schemas.openxmlformats.org/drawingml/2006/wordprocessingDrawing" xmlns:w10="urn:schemas-microsoft-com:office:word" xmlns:w="http://schemas.openxmlformats.org/wordprocessingml/2006/main" xmlns:w14="http://schemas.microsoft.com/office/word/2010/wordml" xmlns:w15="http://schemas.microsoft.com/office/word/2012/wordml" xmlns:w16cex="http://schemas.microsoft.com/office/word/2018/wordml/cex" xmlns:w16cid="http://schemas.microsoft.com/office/word/2016/wordml/cid" xmlns:w16="http://schemas.microsoft.com/office/word/2018/wordml" xmlns:w16sdtdh="http://schemas.microsoft.com/office/word/2020/wordml/sdtdatahash" xmlns:w16se="http://schemas.microsoft.com/office/word/2015/wordml/symex" xmlns:wpg="http://schemas.microsoft.com/office/word/2010/wordprocessingGroup" xmlns:wpi="http://schemas.microsoft.com/office/word/2010/wordprocessingInk" xmlns:wne="http://schemas.microsoft.com/office/word/2006/wordml" xmlns:wps="http://schemas.microsoft.com/office/word/2010/wordprocessingShape" mc:Ignorable="w14 w15 w16se w16cid w16 w16cex w16sdtdh wp14">
+<w:numbering xmlns:wpc="http://schemas.microsoft.com/office/word/2010/wordprocessingCanvas" xmlns:cx="http://schemas.microsoft.com/office/drawing/2014/chartex" xmlns:cx1="http://schemas.microsoft.com/office/drawing/2015/9/8/chartex" xmlns:cx2="http://schemas.microsoft.com/office/drawing/2015/10/21/chartex" xmlns:cx3="http://schemas.microsoft.com/office/drawing/2016/5/9/chartex" xmlns:cx4="http://schemas.microsoft.com/office/drawing/2016/5/10/chartex" xmlns:cx5="http://schemas.microsoft.com/office/drawing/2016/5/11/chartex" xmlns:cx6="http://schemas.microsoft.com/office/drawing/2016/5/12/chartex" xmlns:cx7="http://schemas.microsoft.com/office/drawing/2016/5/13/chartex" xmlns:cx8="http://schemas.microsoft.com/office/drawing/2016/5/14/chartex" xmlns:mc="http://schemas.openxmlformats.org/markup-compatibility/2006" xmlns:aink="http://schemas.microsoft.com/office/drawing/2016/ink" xmlns:am3d="http://schemas.microsoft.com/office/drawing/2017/model3d" xmlns:o="urn:schemas-microsoft-com:office:office" xmlns:oel="http://schemas.microsoft.com/office/2019/extlst" xmlns:r="http://schemas.openxmlformats.org/officeDocument/2006/relationships" xmlns:m="http://schemas.openxmlformats.org/officeDocument/2006/math" xmlns:v="urn:schemas-microsoft-com:vml" xmlns:wp14="http://schemas.microsoft.com/office/word/2010/wordprocessingDrawing" xmlns:wp="http://schemas.openxmlformats.org/drawingml/2006/wordprocessingDrawing" xmlns:w10="urn:schemas-microsoft-com:office:word" xmlns:w="http://schemas.openxmlformats.org/wordprocessingml/2006/main" xmlns:w14="http://schemas.microsoft.com/office/word/2010/wordml" xmlns:w15="http://schemas.microsoft.com/office/word/2012/wordml" xmlns:w16cex="http://schemas.microsoft.com/office/word/2018/wordml/cex" xmlns:w16cid="http://schemas.microsoft.com/office/word/2016/wordml/cid" xmlns:w16="http://schemas.microsoft.com/office/word/2018/wordml" xmlns:w16du="http://schemas.microsoft.com/office/word/2023/wordml/word16du" xmlns:w16sdtdh="http://schemas.microsoft.com/office/word/2020/wordml/sdtdatahash" xmlns:w16se="http://schemas.microsoft.com/office/word/2015/wordml/symex" xmlns:wpg="http://schemas.microsoft.com/office/word/2010/wordprocessingGroup" xmlns:wpi="http://schemas.microsoft.com/office/word/2010/wordprocessingInk" xmlns:wne="http://schemas.microsoft.com/office/word/2006/wordml" xmlns:wps="http://schemas.microsoft.com/office/word/2010/wordprocessingShape" mc:Ignorable="w14 w15 w16se w16cid w16 w16cex w16sdtdh w16du wp14">
   <w:abstractNum w:abstractNumId="0" w15:restartNumberingAfterBreak="0">
     <w:nsid w:val="76B4186A"/>
     <w:multiLevelType w:val="hybridMultilevel"/>
@@ -3221,7 +3299,7 @@
 </file>
 
 <file path=word/styles.xml><?xml version="1.0" encoding="utf-8"?>
-<w:styles xmlns:mc="http://schemas.openxmlformats.org/markup-compatibility/2006" xmlns:r="http://schemas.openxmlformats.org/officeDocument/2006/relationships" xmlns:w="http://schemas.openxmlformats.org/wordprocessingml/2006/main" xmlns:w14="http://schemas.microsoft.com/office/word/2010/wordml" xmlns:w15="http://schemas.microsoft.com/office/word/2012/wordml" xmlns:w16cex="http://schemas.microsoft.com/office/word/2018/wordml/cex" xmlns:w16cid="http://schemas.microsoft.com/office/word/2016/wordml/cid" xmlns:w16="http://schemas.microsoft.com/office/word/2018/wordml" xmlns:w16sdtdh="http://schemas.microsoft.com/office/word/2020/wordml/sdtdatahash" xmlns:w16se="http://schemas.microsoft.com/office/word/2015/wordml/symex" mc:Ignorable="w14 w15 w16se w16cid w16 w16cex w16sdtdh">
+<w:styles xmlns:mc="http://schemas.openxmlformats.org/markup-compatibility/2006" xmlns:r="http://schemas.openxmlformats.org/officeDocument/2006/relationships" xmlns:w="http://schemas.openxmlformats.org/wordprocessingml/2006/main" xmlns:w14="http://schemas.microsoft.com/office/word/2010/wordml" xmlns:w15="http://schemas.microsoft.com/office/word/2012/wordml" xmlns:w16cex="http://schemas.microsoft.com/office/word/2018/wordml/cex" xmlns:w16cid="http://schemas.microsoft.com/office/word/2016/wordml/cid" xmlns:w16="http://schemas.microsoft.com/office/word/2018/wordml" xmlns:w16du="http://schemas.microsoft.com/office/word/2023/wordml/word16du" xmlns:w16sdtdh="http://schemas.microsoft.com/office/word/2020/wordml/sdtdatahash" xmlns:w16se="http://schemas.microsoft.com/office/word/2015/wordml/symex" mc:Ignorable="w14 w15 w16se w16cid w16 w16cex w16sdtdh w16du">
   <w:docDefaults>
     <w:rPrDefault>
       <w:rPr>
@@ -3621,11 +3699,11 @@
     <w:name w:val="Normal"/>
     <w:qFormat/>
   </w:style>
-  <w:style w:type="paragraph" w:styleId="Heading1">
+  <w:style w:type="paragraph" w:styleId="Overskrift1">
     <w:name w:val="heading 1"/>
     <w:basedOn w:val="Normal"/>
     <w:next w:val="Normal"/>
-    <w:link w:val="Heading1Char"/>
+    <w:link w:val="Overskrift1Tegn"/>
     <w:uiPriority w:val="9"/>
     <w:qFormat/>
     <w:rsid w:val="00993880"/>
@@ -3642,11 +3720,11 @@
       <w:szCs w:val="32"/>
     </w:rPr>
   </w:style>
-  <w:style w:type="paragraph" w:styleId="Heading2">
+  <w:style w:type="paragraph" w:styleId="Overskrift2">
     <w:name w:val="heading 2"/>
     <w:basedOn w:val="Normal"/>
     <w:next w:val="Normal"/>
-    <w:link w:val="Heading2Char"/>
+    <w:link w:val="Overskrift2Tegn"/>
     <w:uiPriority w:val="9"/>
     <w:unhideWhenUsed/>
     <w:qFormat/>
@@ -3664,11 +3742,11 @@
       <w:szCs w:val="26"/>
     </w:rPr>
   </w:style>
-  <w:style w:type="paragraph" w:styleId="Heading3">
+  <w:style w:type="paragraph" w:styleId="Overskrift3">
     <w:name w:val="heading 3"/>
     <w:basedOn w:val="Normal"/>
     <w:next w:val="Normal"/>
-    <w:link w:val="Heading3Char"/>
+    <w:link w:val="Overskrift3Tegn"/>
     <w:uiPriority w:val="9"/>
     <w:unhideWhenUsed/>
     <w:qFormat/>
@@ -3686,13 +3764,13 @@
       <w:szCs w:val="24"/>
     </w:rPr>
   </w:style>
-  <w:style w:type="character" w:default="1" w:styleId="DefaultParagraphFont">
+  <w:style w:type="character" w:default="1" w:styleId="Standardskrifttypeiafsnit">
     <w:name w:val="Default Paragraph Font"/>
     <w:uiPriority w:val="1"/>
     <w:semiHidden/>
     <w:unhideWhenUsed/>
   </w:style>
-  <w:style w:type="table" w:default="1" w:styleId="TableNormal">
+  <w:style w:type="table" w:default="1" w:styleId="Tabel-Normal">
     <w:name w:val="Normal Table"/>
     <w:uiPriority w:val="99"/>
     <w:semiHidden/>
@@ -3707,13 +3785,13 @@
       </w:tblCellMar>
     </w:tblPr>
   </w:style>
-  <w:style w:type="numbering" w:default="1" w:styleId="NoList">
+  <w:style w:type="numbering" w:default="1" w:styleId="Ingenoversigt">
     <w:name w:val="No List"/>
     <w:uiPriority w:val="99"/>
     <w:semiHidden/>
     <w:unhideWhenUsed/>
   </w:style>
-  <w:style w:type="paragraph" w:styleId="ListParagraph">
+  <w:style w:type="paragraph" w:styleId="Listeafsnit">
     <w:name w:val="List Paragraph"/>
     <w:basedOn w:val="Normal"/>
     <w:uiPriority w:val="34"/>
@@ -3726,7 +3804,7 @@
   </w:style>
   <w:style w:type="character" w:styleId="Hyperlink">
     <w:name w:val="Hyperlink"/>
-    <w:basedOn w:val="DefaultParagraphFont"/>
+    <w:basedOn w:val="Standardskrifttypeiafsnit"/>
     <w:uiPriority w:val="99"/>
     <w:unhideWhenUsed/>
     <w:rsid w:val="00802578"/>
@@ -3735,9 +3813,9 @@
       <w:u w:val="single"/>
     </w:rPr>
   </w:style>
-  <w:style w:type="character" w:styleId="UnresolvedMention">
+  <w:style w:type="character" w:styleId="Ulstomtale">
     <w:name w:val="Unresolved Mention"/>
-    <w:basedOn w:val="DefaultParagraphFont"/>
+    <w:basedOn w:val="Standardskrifttypeiafsnit"/>
     <w:uiPriority w:val="99"/>
     <w:semiHidden/>
     <w:unhideWhenUsed/>
@@ -3747,9 +3825,9 @@
       <w:shd w:val="clear" w:color="auto" w:fill="E1DFDD"/>
     </w:rPr>
   </w:style>
-  <w:style w:type="character" w:styleId="Strong">
+  <w:style w:type="character" w:styleId="Strk">
     <w:name w:val="Strong"/>
-    <w:basedOn w:val="DefaultParagraphFont"/>
+    <w:basedOn w:val="Standardskrifttypeiafsnit"/>
     <w:uiPriority w:val="22"/>
     <w:qFormat/>
     <w:rsid w:val="00993880"/>
@@ -3758,10 +3836,10 @@
       <w:bCs/>
     </w:rPr>
   </w:style>
-  <w:style w:type="character" w:customStyle="1" w:styleId="Heading2Char">
-    <w:name w:val="Heading 2 Char"/>
-    <w:basedOn w:val="DefaultParagraphFont"/>
-    <w:link w:val="Heading2"/>
+  <w:style w:type="character" w:customStyle="1" w:styleId="Overskrift2Tegn">
+    <w:name w:val="Overskrift 2 Tegn"/>
+    <w:basedOn w:val="Standardskrifttypeiafsnit"/>
+    <w:link w:val="Overskrift2"/>
     <w:uiPriority w:val="9"/>
     <w:rsid w:val="00993880"/>
     <w:rPr>
@@ -3771,10 +3849,10 @@
       <w:szCs w:val="26"/>
     </w:rPr>
   </w:style>
-  <w:style w:type="character" w:customStyle="1" w:styleId="Heading3Char">
-    <w:name w:val="Heading 3 Char"/>
-    <w:basedOn w:val="DefaultParagraphFont"/>
-    <w:link w:val="Heading3"/>
+  <w:style w:type="character" w:customStyle="1" w:styleId="Overskrift3Tegn">
+    <w:name w:val="Overskrift 3 Tegn"/>
+    <w:basedOn w:val="Standardskrifttypeiafsnit"/>
+    <w:link w:val="Overskrift3"/>
     <w:uiPriority w:val="9"/>
     <w:rsid w:val="00993880"/>
     <w:rPr>
@@ -3784,10 +3862,10 @@
       <w:szCs w:val="24"/>
     </w:rPr>
   </w:style>
-  <w:style w:type="character" w:customStyle="1" w:styleId="Heading1Char">
-    <w:name w:val="Heading 1 Char"/>
-    <w:basedOn w:val="DefaultParagraphFont"/>
-    <w:link w:val="Heading1"/>
+  <w:style w:type="character" w:customStyle="1" w:styleId="Overskrift1Tegn">
+    <w:name w:val="Overskrift 1 Tegn"/>
+    <w:basedOn w:val="Standardskrifttypeiafsnit"/>
+    <w:link w:val="Overskrift1"/>
     <w:uiPriority w:val="9"/>
     <w:rsid w:val="00993880"/>
     <w:rPr>
@@ -3797,9 +3875,9 @@
       <w:szCs w:val="32"/>
     </w:rPr>
   </w:style>
-  <w:style w:type="paragraph" w:styleId="TOCHeading">
+  <w:style w:type="paragraph" w:styleId="Overskrift">
     <w:name w:val="TOC Heading"/>
-    <w:basedOn w:val="Heading1"/>
+    <w:basedOn w:val="Overskrift1"/>
     <w:next w:val="Normal"/>
     <w:uiPriority w:val="39"/>
     <w:unhideWhenUsed/>
@@ -3814,7 +3892,7 @@
       <w14:ligatures w14:val="none"/>
     </w:rPr>
   </w:style>
-  <w:style w:type="paragraph" w:styleId="TOC1">
+  <w:style w:type="paragraph" w:styleId="Indholdsfortegnelse1">
     <w:name w:val="toc 1"/>
     <w:basedOn w:val="Normal"/>
     <w:next w:val="Normal"/>
@@ -3826,7 +3904,7 @@
       <w:spacing w:after="100"/>
     </w:pPr>
   </w:style>
-  <w:style w:type="paragraph" w:styleId="TOC2">
+  <w:style w:type="paragraph" w:styleId="Indholdsfortegnelse2">
     <w:name w:val="toc 2"/>
     <w:basedOn w:val="Normal"/>
     <w:next w:val="Normal"/>
@@ -3839,11 +3917,11 @@
       <w:ind w:left="220"/>
     </w:pPr>
   </w:style>
-  <w:style w:type="paragraph" w:styleId="Title">
+  <w:style w:type="paragraph" w:styleId="Titel">
     <w:name w:val="Title"/>
     <w:basedOn w:val="Normal"/>
     <w:next w:val="Normal"/>
-    <w:link w:val="TitleChar"/>
+    <w:link w:val="TitelTegn"/>
     <w:uiPriority w:val="10"/>
     <w:qFormat/>
     <w:rsid w:val="001F1147"/>
@@ -3859,10 +3937,10 @@
       <w:szCs w:val="56"/>
     </w:rPr>
   </w:style>
-  <w:style w:type="character" w:customStyle="1" w:styleId="TitleChar">
-    <w:name w:val="Title Char"/>
-    <w:basedOn w:val="DefaultParagraphFont"/>
-    <w:link w:val="Title"/>
+  <w:style w:type="character" w:customStyle="1" w:styleId="TitelTegn">
+    <w:name w:val="Titel Tegn"/>
+    <w:basedOn w:val="Standardskrifttypeiafsnit"/>
+    <w:link w:val="Titel"/>
     <w:uiPriority w:val="10"/>
     <w:rsid w:val="001F1147"/>
     <w:rPr>
@@ -3873,10 +3951,10 @@
       <w:szCs w:val="56"/>
     </w:rPr>
   </w:style>
-  <w:style w:type="paragraph" w:styleId="FootnoteText">
+  <w:style w:type="paragraph" w:styleId="Fodnotetekst">
     <w:name w:val="footnote text"/>
     <w:basedOn w:val="Normal"/>
-    <w:link w:val="FootnoteTextChar"/>
+    <w:link w:val="FodnotetekstTegn"/>
     <w:uiPriority w:val="99"/>
     <w:semiHidden/>
     <w:unhideWhenUsed/>
@@ -3889,10 +3967,10 @@
       <w:szCs w:val="20"/>
     </w:rPr>
   </w:style>
-  <w:style w:type="character" w:customStyle="1" w:styleId="FootnoteTextChar">
-    <w:name w:val="Footnote Text Char"/>
-    <w:basedOn w:val="DefaultParagraphFont"/>
-    <w:link w:val="FootnoteText"/>
+  <w:style w:type="character" w:customStyle="1" w:styleId="FodnotetekstTegn">
+    <w:name w:val="Fodnotetekst Tegn"/>
+    <w:basedOn w:val="Standardskrifttypeiafsnit"/>
+    <w:link w:val="Fodnotetekst"/>
     <w:uiPriority w:val="99"/>
     <w:semiHidden/>
     <w:rsid w:val="002341E4"/>
@@ -3901,9 +3979,9 @@
       <w:szCs w:val="20"/>
     </w:rPr>
   </w:style>
-  <w:style w:type="character" w:styleId="FootnoteReference">
+  <w:style w:type="character" w:styleId="Fodnotehenvisning">
     <w:name w:val="footnote reference"/>
-    <w:basedOn w:val="DefaultParagraphFont"/>
+    <w:basedOn w:val="Standardskrifttypeiafsnit"/>
     <w:uiPriority w:val="99"/>
     <w:semiHidden/>
     <w:unhideWhenUsed/>

</xml_diff>

<commit_message>
updated excel sheet generator, error fixed
</commit_message>
<xml_diff>
--- a/Manual.docx
+++ b/Manual.docx
@@ -55,7 +55,7 @@
         <w:rPr>
           <w:lang w:val="en-US"/>
         </w:rPr>
-        <w:t>3</w:t>
+        <w:t>4</w:t>
       </w:r>
       <w:r>
         <w:rPr>
@@ -67,7 +67,7 @@
         <w:rPr>
           <w:lang w:val="en-US"/>
         </w:rPr>
-        <w:t>08</w:t>
+        <w:t>17</w:t>
       </w:r>
     </w:p>
     <w:p>
@@ -2889,35 +2889,72 @@
           <w:rFonts w:ascii="Times" w:hAnsi="Times" w:cs="Times"/>
           <w:lang w:val="en-US"/>
         </w:rPr>
-        <w:t>be more rigid. I indicate if the format is required or recommended</w:t>
-      </w:r>
-      <w:r>
-        <w:rPr>
-          <w:rFonts w:ascii="Times" w:hAnsi="Times" w:cs="Times"/>
-          <w:lang w:val="en-US"/>
-        </w:rPr>
-        <w:t xml:space="preserve"> but I</w:t>
-      </w:r>
-      <w:r>
-        <w:rPr>
-          <w:rFonts w:ascii="Times" w:hAnsi="Times" w:cs="Times"/>
-          <w:lang w:val="en-US"/>
-        </w:rPr>
-        <w:t xml:space="preserve"> suggest you try to comply with the recommended formatting </w:t>
-      </w:r>
-      <w:r>
-        <w:rPr>
-          <w:rFonts w:ascii="Times" w:hAnsi="Times" w:cs="Times"/>
-          <w:lang w:val="en-US"/>
-        </w:rPr>
-        <w:t>as well</w:t>
-      </w:r>
-      <w:r>
-        <w:rPr>
-          <w:rFonts w:ascii="Times" w:hAnsi="Times" w:cs="Times"/>
-          <w:lang w:val="en-US"/>
-        </w:rPr>
-        <w:t xml:space="preserve"> pointing forward, </w:t>
+        <w:t xml:space="preserve">be more rigid. I indicate if the format is </w:t>
+      </w:r>
+      <w:r>
+        <w:rPr>
+          <w:rFonts w:ascii="Times" w:hAnsi="Times" w:cs="Times"/>
+          <w:lang w:val="en-US"/>
+        </w:rPr>
+        <w:t xml:space="preserve">currently </w:t>
+      </w:r>
+      <w:r>
+        <w:rPr>
+          <w:rFonts w:ascii="Times" w:hAnsi="Times" w:cs="Times"/>
+          <w:lang w:val="en-US"/>
+        </w:rPr>
+        <w:t>required or recommended</w:t>
+      </w:r>
+      <w:r>
+        <w:rPr>
+          <w:rFonts w:ascii="Times" w:hAnsi="Times" w:cs="Times"/>
+          <w:lang w:val="en-US"/>
+        </w:rPr>
+        <w:t xml:space="preserve"> </w:t>
+      </w:r>
+      <w:r>
+        <w:rPr>
+          <w:rFonts w:ascii="Times" w:hAnsi="Times" w:cs="Times"/>
+          <w:lang w:val="en-US"/>
+        </w:rPr>
+        <w:t>and</w:t>
+      </w:r>
+      <w:r>
+        <w:rPr>
+          <w:rFonts w:ascii="Times" w:hAnsi="Times" w:cs="Times"/>
+          <w:lang w:val="en-US"/>
+        </w:rPr>
+        <w:t xml:space="preserve"> I</w:t>
+      </w:r>
+      <w:r>
+        <w:rPr>
+          <w:rFonts w:ascii="Times" w:hAnsi="Times" w:cs="Times"/>
+          <w:lang w:val="en-US"/>
+        </w:rPr>
+        <w:t xml:space="preserve"> </w:t>
+      </w:r>
+      <w:r>
+        <w:rPr>
+          <w:rFonts w:ascii="Times" w:hAnsi="Times" w:cs="Times"/>
+          <w:lang w:val="en-US"/>
+        </w:rPr>
+        <w:t xml:space="preserve">strongly recommend you </w:t>
+      </w:r>
+      <w:proofErr w:type="gramStart"/>
+      <w:r>
+        <w:rPr>
+          <w:rFonts w:ascii="Times" w:hAnsi="Times" w:cs="Times"/>
+          <w:lang w:val="en-US"/>
+        </w:rPr>
+        <w:t>to comply</w:t>
+      </w:r>
+      <w:proofErr w:type="gramEnd"/>
+      <w:r>
+        <w:rPr>
+          <w:rFonts w:ascii="Times" w:hAnsi="Times" w:cs="Times"/>
+          <w:lang w:val="en-US"/>
+        </w:rPr>
+        <w:t xml:space="preserve"> with the recommended formatting, </w:t>
       </w:r>
       <w:r>
         <w:rPr>
@@ -2931,14 +2968,35 @@
           <w:rFonts w:ascii="Times" w:hAnsi="Times" w:cs="Times"/>
           <w:lang w:val="en-US"/>
         </w:rPr>
-        <w:t>o prevent any tedious data cleanup</w:t>
-      </w:r>
-      <w:r>
-        <w:rPr>
-          <w:rFonts w:ascii="Times" w:hAnsi="Times" w:cs="Times"/>
-          <w:lang w:val="en-US"/>
-        </w:rPr>
-        <w:t xml:space="preserve"> in the future as the recommended formats will most likely become required eventually.</w:t>
+        <w:t xml:space="preserve">o </w:t>
+      </w:r>
+      <w:r>
+        <w:rPr>
+          <w:rFonts w:ascii="Times" w:hAnsi="Times" w:cs="Times"/>
+          <w:lang w:val="en-US"/>
+        </w:rPr>
+        <w:t>prevent</w:t>
+      </w:r>
+      <w:r>
+        <w:rPr>
+          <w:rFonts w:ascii="Times" w:hAnsi="Times" w:cs="Times"/>
+          <w:lang w:val="en-US"/>
+        </w:rPr>
+        <w:t xml:space="preserve"> </w:t>
+      </w:r>
+      <w:r>
+        <w:rPr>
+          <w:rFonts w:ascii="Times" w:hAnsi="Times" w:cs="Times"/>
+          <w:lang w:val="en-US"/>
+        </w:rPr>
+        <w:t>any tedious data cleanup</w:t>
+      </w:r>
+      <w:r>
+        <w:rPr>
+          <w:rFonts w:ascii="Times" w:hAnsi="Times" w:cs="Times"/>
+          <w:lang w:val="en-US"/>
+        </w:rPr>
+        <w:t xml:space="preserve"> in the future.</w:t>
       </w:r>
     </w:p>
     <w:p>
@@ -2967,11 +3025,10 @@
       </w:r>
       <w:r>
         <w:rPr>
-          <w:rStyle w:val="Heading2Char"/>
-          <w:rFonts w:ascii="Times" w:hAnsi="Times" w:cs="Times"/>
-          <w:lang w:val="en-US"/>
-        </w:rPr>
-        <w:t>recommendation</w:t>
+          <w:rFonts w:ascii="Times" w:hAnsi="Times" w:cs="Times"/>
+          <w:lang w:val="en-US"/>
+        </w:rPr>
+        <w:t>highly recommended</w:t>
       </w:r>
       <w:r>
         <w:rPr>
@@ -3153,7 +3210,7 @@
           <w:rFonts w:ascii="Times" w:hAnsi="Times" w:cs="Times"/>
           <w:lang w:val="en-US"/>
         </w:rPr>
-        <w:t>s (</w:t>
+        <w:t>s</w:t>
       </w:r>
       <w:r>
         <w:rPr>
@@ -3161,15 +3218,7 @@
           <w:rFonts w:ascii="Times" w:hAnsi="Times" w:cs="Times"/>
           <w:lang w:val="en-US"/>
         </w:rPr>
-        <w:t>recommendation</w:t>
-      </w:r>
-      <w:r>
-        <w:rPr>
-          <w:rStyle w:val="Heading2Char"/>
-          <w:rFonts w:ascii="Times" w:hAnsi="Times" w:cs="Times"/>
-          <w:lang w:val="en-US"/>
-        </w:rPr>
-        <w:t>)</w:t>
+        <w:t xml:space="preserve"> (highly recommended)</w:t>
       </w:r>
       <w:bookmarkEnd w:id="8"/>
       <w:bookmarkEnd w:id="9"/>
@@ -3508,11 +3557,10 @@
       </w:r>
       <w:r>
         <w:rPr>
-          <w:rStyle w:val="Heading2Char"/>
-          <w:rFonts w:ascii="Times" w:hAnsi="Times" w:cs="Times"/>
-          <w:lang w:val="en-US"/>
-        </w:rPr>
-        <w:t>recommendation</w:t>
+          <w:rFonts w:ascii="Times" w:hAnsi="Times" w:cs="Times"/>
+          <w:lang w:val="en-US"/>
+        </w:rPr>
+        <w:t>highly recommended</w:t>
       </w:r>
       <w:r>
         <w:rPr>
@@ -3565,11 +3613,26 @@
       </w:r>
       <w:r>
         <w:rPr>
+          <w:rFonts w:ascii="Times" w:hAnsi="Times" w:cs="Times"/>
+          <w:lang w:val="en-US"/>
+        </w:rPr>
+        <w:t xml:space="preserve">highly </w:t>
+      </w:r>
+      <w:r>
+        <w:rPr>
           <w:rStyle w:val="Heading2Char"/>
           <w:rFonts w:ascii="Times" w:hAnsi="Times" w:cs="Times"/>
           <w:lang w:val="en-US"/>
         </w:rPr>
-        <w:t>recommendation</w:t>
+        <w:t>recommend</w:t>
+      </w:r>
+      <w:r>
+        <w:rPr>
+          <w:rStyle w:val="Heading2Char"/>
+          <w:rFonts w:ascii="Times" w:hAnsi="Times" w:cs="Times"/>
+          <w:lang w:val="en-US"/>
+        </w:rPr>
+        <w:t>ed</w:t>
       </w:r>
       <w:r>
         <w:rPr>
@@ -3623,6 +3686,138 @@
           <w:lang w:val="en-US"/>
         </w:rPr>
         <w:t>External: Use email</w:t>
+      </w:r>
+    </w:p>
+    <w:p>
+      <w:pPr>
+        <w:pStyle w:val="Heading2"/>
+        <w:rPr>
+          <w:rFonts w:ascii="Times" w:hAnsi="Times" w:cs="Times"/>
+          <w:lang w:val="en-US"/>
+        </w:rPr>
+      </w:pPr>
+    </w:p>
+    <w:p>
+      <w:pPr>
+        <w:pStyle w:val="Heading2"/>
+        <w:rPr>
+          <w:rFonts w:ascii="Times" w:hAnsi="Times" w:cs="Times"/>
+          <w:lang w:val="en-US"/>
+        </w:rPr>
+      </w:pPr>
+      <w:r>
+        <w:rPr>
+          <w:rFonts w:ascii="Times" w:hAnsi="Times" w:cs="Times"/>
+          <w:lang w:val="en-US"/>
+        </w:rPr>
+        <w:t>Date</w:t>
+      </w:r>
+      <w:r>
+        <w:rPr>
+          <w:rFonts w:ascii="Times" w:hAnsi="Times" w:cs="Times"/>
+          <w:lang w:val="en-US"/>
+        </w:rPr>
+        <w:t xml:space="preserve"> (</w:t>
+      </w:r>
+      <w:r>
+        <w:rPr>
+          <w:rFonts w:ascii="Times" w:hAnsi="Times" w:cs="Times"/>
+          <w:lang w:val="en-US"/>
+        </w:rPr>
+        <w:t xml:space="preserve">highly </w:t>
+      </w:r>
+      <w:r>
+        <w:rPr>
+          <w:rStyle w:val="Heading2Char"/>
+          <w:rFonts w:ascii="Times" w:hAnsi="Times" w:cs="Times"/>
+          <w:lang w:val="en-US"/>
+        </w:rPr>
+        <w:t>recommended</w:t>
+      </w:r>
+      <w:r>
+        <w:rPr>
+          <w:rFonts w:ascii="Times" w:hAnsi="Times" w:cs="Times"/>
+          <w:lang w:val="en-US"/>
+        </w:rPr>
+        <w:t>)</w:t>
+      </w:r>
+    </w:p>
+    <w:p>
+      <w:pPr>
+        <w:rPr>
+          <w:rFonts w:ascii="Times" w:hAnsi="Times" w:cs="Times"/>
+          <w:lang w:val="en-US"/>
+        </w:rPr>
+      </w:pPr>
+      <w:r>
+        <w:rPr>
+          <w:rFonts w:ascii="Times" w:hAnsi="Times" w:cs="Times"/>
+          <w:lang w:val="en-US"/>
+        </w:rPr>
+        <w:t xml:space="preserve">Use </w:t>
+      </w:r>
+      <w:r>
+        <w:rPr>
+          <w:rFonts w:ascii="Times" w:hAnsi="Times" w:cs="Times"/>
+          <w:lang w:val="en-US"/>
+        </w:rPr>
+        <w:t>ISO_8601</w:t>
+      </w:r>
+      <w:r>
+        <w:rPr>
+          <w:rFonts w:ascii="Times" w:hAnsi="Times" w:cs="Times"/>
+          <w:lang w:val="en-US"/>
+        </w:rPr>
+        <w:t xml:space="preserve"> standard: YYYY-</w:t>
+      </w:r>
+      <w:r>
+        <w:rPr>
+          <w:rFonts w:ascii="Times" w:hAnsi="Times" w:cs="Times"/>
+          <w:lang w:val="en-US"/>
+        </w:rPr>
+        <w:t>MM</w:t>
+      </w:r>
+      <w:r>
+        <w:rPr>
+          <w:rFonts w:ascii="Times" w:hAnsi="Times" w:cs="Times"/>
+          <w:lang w:val="en-US"/>
+        </w:rPr>
+        <w:t>-</w:t>
+      </w:r>
+      <w:r>
+        <w:rPr>
+          <w:rFonts w:ascii="Times" w:hAnsi="Times" w:cs="Times"/>
+          <w:lang w:val="en-US"/>
+        </w:rPr>
+        <w:t>DD</w:t>
+      </w:r>
+      <w:r>
+        <w:rPr>
+          <w:rFonts w:ascii="Times" w:hAnsi="Times" w:cs="Times"/>
+          <w:lang w:val="en-US"/>
+        </w:rPr>
+        <w:t xml:space="preserve"> </w:t>
+      </w:r>
+      <w:r>
+        <w:rPr>
+          <w:rFonts w:ascii="Times" w:hAnsi="Times" w:cs="Times"/>
+          <w:lang w:val="en-US"/>
+        </w:rPr>
+        <w:t>(</w:t>
+      </w:r>
+      <w:r>
+        <w:rPr>
+          <w:rFonts w:ascii="Times" w:hAnsi="Times" w:cs="Times"/>
+          <w:lang w:val="en-US"/>
+        </w:rPr>
+        <w:t>https://en.wikipedia.org/wiki/ISO_8601</w:t>
+      </w:r>
+      <w:r>
+        <w:rPr>
+          <w:rFonts w:ascii="Times" w:hAnsi="Times" w:cs="Times"/>
+          <w:lang w:val="en-US"/>
+        </w:rPr>
+        <w:t>)</w:t>
       </w:r>
     </w:p>
     <w:p>
@@ -4613,7 +4808,7 @@
   <w:style w:type="paragraph" w:default="1" w:styleId="Normal">
     <w:name w:val="Normal"/>
     <w:qFormat/>
-    <w:rsid w:val="00D152C3"/>
+    <w:rsid w:val="0078461B"/>
   </w:style>
   <w:style w:type="paragraph" w:styleId="Heading1">
     <w:name w:val="heading 1"/>

</xml_diff>

<commit_message>
manual and ex template update
</commit_message>
<xml_diff>
--- a/Manual.docx
+++ b/Manual.docx
@@ -58,7 +58,7 @@
         <w:rPr>
           <w:lang w:val="en-US"/>
         </w:rPr>
-        <w:t>04</w:t>
+        <w:t>10</w:t>
       </w:r>
     </w:p>
     <w:p>
@@ -1048,6 +1048,20 @@
           <w:lang w:val="en-US"/>
         </w:rPr>
         <w:t>Log in and connect to the KU VPN</w:t>
+      </w:r>
+      <w:r>
+        <w:rPr>
+          <w:rFonts w:ascii="Times" w:hAnsi="Times" w:cs="Times"/>
+          <w:lang w:val="en-US"/>
+        </w:rPr>
+        <w:t xml:space="preserve">. See here how to install Cisco and connect to the VPN: </w:t>
+      </w:r>
+      <w:r>
+        <w:rPr>
+          <w:rFonts w:ascii="Times" w:hAnsi="Times" w:cs="Times"/>
+          <w:lang w:val="en-US"/>
+        </w:rPr>
+        <w:t>https://kunet.ku.dk/medarbejderguide/Sider/It/Fjernadgang-vpn.aspx?searchHitHighlight=vpn</w:t>
       </w:r>
     </w:p>
     <w:p>
@@ -2782,6 +2796,7 @@
           <w:rFonts w:ascii="Times" w:hAnsi="Times" w:cs="Times"/>
           <w:lang w:val="en-US"/>
         </w:rPr>
+        <w:lastRenderedPageBreak/>
         <w:t>Press upload</w:t>
       </w:r>
       <w:r>
@@ -3818,6 +3833,7 @@
                 <w:lang w:eastAsia="da-DK"/>
                 <w14:ligatures w14:val="none"/>
               </w:rPr>
+              <w:lastRenderedPageBreak/>
               <w:t>Initials</w:t>
             </w:r>
           </w:p>

</xml_diff>